<commit_message>
Publisher watermark on the files themselves; credit the publisher
- The watermark is now part of the content: drawn into PDF pages and images,
  tiled over each Word page, slide, sheet, e-book view and video. The
  full-screen overlay is gone.
- The admin chooses what it says (Restrictions: publisher name + second line,
  with a live preview). The name starts as the admin's name (migration 7) and
  is also shown as "Published by" on the file page, preview and reader.
- Sample files and covers credit the publisher instead of made-up authors;
  make-samples.mjs and make_demo_catalog.py take the publisher name.
</commit_message>
<xml_diff>
--- a/supabase/sample/files/pathology-notes-vol-1.docx
+++ b/supabase/sample/files/pathology-notes-vol-1.docx
@@ -19,6 +19,15 @@
           <w:sz w:val="22"/>
         </w:rPr>
         <w:t xml:space="preserve">Vol. 1 · Cell Injury &amp; Inflammation</w:t>
+      </w:r>
+    </w:p>
+    <w:p>
+      <w:r>
+        <w:rPr>
+          <w:color w:val="2B579A"/>
+          <w:sz w:val="22"/>
+        </w:rPr>
+        <w:t xml:space="preserve">Published by Fritz Rjhay Dela Cruz</w:t>
       </w:r>
     </w:p>
     <w:p>
@@ -169,7 +178,7 @@
           <w:color w:val="64748B"/>
           <w:sz w:val="22"/>
         </w:rPr>
-        <w:t xml:space="preserve">Sample document for the MedNotes reader.</w:t>
+        <w:t xml:space="preserve">Sample document · © Fritz Rjhay Dela Cruz</w:t>
       </w:r>
     </w:p>
     <w:sectPr/>

</xml_diff>

<commit_message>
Remove reader notes and drawing; data-flow tests across the app; hidden files stay with their buyers; store name reaches the site; sample files under MedNotes Publishing; more device sizes in the layout test
</commit_message>
<xml_diff>
--- a/supabase/sample/files/pathology-notes-vol-1.docx
+++ b/supabase/sample/files/pathology-notes-vol-1.docx
@@ -27,7 +27,7 @@
           <w:color w:val="2B579A"/>
           <w:sz w:val="22"/>
         </w:rPr>
-        <w:t xml:space="preserve">Published by Fritz Rjhay Dela Cruz</w:t>
+        <w:t xml:space="preserve">Published by MedNotes Publishing</w:t>
       </w:r>
     </w:p>
     <w:p>
@@ -178,7 +178,7 @@
           <w:color w:val="64748B"/>
           <w:sz w:val="22"/>
         </w:rPr>
-        <w:t xml:space="preserve">Sample document · © Fritz Rjhay Dela Cruz</w:t>
+        <w:t xml:space="preserve">Sample document · © MedNotes Publishing</w:t>
       </w:r>
     </w:p>
     <w:sectPr/>

</xml_diff>